<commit_message>
Hoopoe: Coo-coo and K International modifications
</commit_message>
<xml_diff>
--- a/data/sample_docs/code_of_conduct.docx
+++ b/data/sample_docs/code_of_conduct.docx
@@ -32,7 +32,7 @@
           <w:sz w:val="17"/>
           <w:szCs w:val="17"/>
         </w:rPr>
-        <w:t xml:space="preserve">Meridian Softworks Pvt. Ltd. — Internal Policy Document (Sample/Reference Only)</w:t>
+        <w:t>K International Pvt. Ltd. — Internal Policy Document (Sample/Reference Only)</w:t>
       </w:r>
     </w:p>
     <w:p>
@@ -60,7 +60,7 @@
           <w:sz w:val="19"/>
           <w:szCs w:val="19"/>
         </w:rPr>
-        <w:t xml:space="preserve">This Code of Conduct sets out the standards of behavior expected from every employee, contractor, and leader at Meridian Softworks Pvt. Ltd..</w:t>
+        <w:t>This Code of Conduct sets out the standards of behavior expected from every employee, contractor, and leader at K International Pvt. Ltd..</w:t>
       </w:r>
     </w:p>
     <w:p>
@@ -368,7 +368,7 @@
           <w:sz w:val="14"/>
           <w:szCs w:val="14"/>
         </w:rPr>
-        <w:t xml:space="preserve">This is a fictional sample document created for demonstration purposes for the Meridian Softworks Pvt. Ltd. Employee Knowledge Assistant project. It does not represent a real company or real policy terms.</w:t>
+        <w:t>This is a fictional sample document created for demonstration purposes for the K International Pvt. Ltd. Employee Knowledge Assistant project. It does not represent a real company or real policy terms.</w:t>
       </w:r>
     </w:p>
     <w:sectPr>

</xml_diff>